<commit_message>
Remove footer from Week1 report
</commit_message>
<xml_diff>
--- a/week1/Week1.docx
+++ b/week1/Week1.docx
@@ -1124,6 +1124,8 @@
         </w:rPr>
         <w:t>. Temporal Coverage and Price-Level Behaviour</w:t>
       </w:r>
+      <w:bookmarkStart w:id="0" w:name="_GoBack"/>
+      <w:bookmarkEnd w:id="0"/>
     </w:p>
     <w:p>
       <w:pPr>
@@ -1224,7 +1226,6 @@
           <w:color w:val="auto"/>
         </w:rPr>
       </w:pPr>
-      <w:bookmarkStart w:id="0" w:name="_GoBack"/>
       <w:r>
         <w:rPr>
           <w:rFonts w:hint="default" w:ascii="Times New Roman" w:hAnsi="Times New Roman" w:cs="Times New Roman"/>
@@ -1268,7 +1269,6 @@
           </wp:inline>
         </w:drawing>
       </w:r>
-      <w:bookmarkEnd w:id="0"/>
     </w:p>
     <w:p>
       <w:pPr>
@@ -1814,12 +1814,6 @@
             <w:insideH w:val="single" w:color="auto" w:sz="4" w:space="0"/>
             <w:insideV w:val="single" w:color="auto" w:sz="4" w:space="0"/>
           </w:tblBorders>
-          <w:tblCellMar>
-            <w:top w:w="0" w:type="dxa"/>
-            <w:left w:w="108" w:type="dxa"/>
-            <w:bottom w:w="0" w:type="dxa"/>
-            <w:right w:w="108" w:type="dxa"/>
-          </w:tblCellMar>
         </w:tblPrEx>
         <w:trPr>
           <w:cantSplit/>

</xml_diff>